<commit_message>
Clean report title formatting
</commit_message>
<xml_diff>
--- a/outputs/TENKI_sales_model_boss_report_google_docs.docx
+++ b/outputs/TENKI_sales_model_boss_report_google_docs.docx
@@ -4,7 +4,7 @@
   <w:body>
     <w:p>
       <w:pPr>
-        <w:spacing w:before="0" w:after="60"/>
+        <w:spacing w:before="0" w:after="280"/>
       </w:pPr>
       <w:r>
         <w:rPr>
@@ -14,19 +14,6 @@
           <w:sz w:val="52"/>
         </w:rPr>
         <w:t>TENKI Rakuten Sales Prediction Model</w:t>
-      </w:r>
-    </w:p>
-    <w:p>
-      <w:pPr>
-        <w:spacing w:after="280"/>
-      </w:pPr>
-      <w:r>
-        <w:rPr>
-          <w:rFonts w:ascii="Arial" w:hAnsi="Arial"/>
-          <w:color w:val="555555"/>
-          <w:sz w:val="22"/>
-        </w:rPr>
-        <w:t>Boss report draft | Prepared for review</w:t>
       </w:r>
     </w:p>
     <w:p>
@@ -1972,10 +1959,10 @@
   <w:docDefaults>
     <w:rPrDefault>
       <w:rPr>
-        <w:rFonts w:asciiTheme="minorHAnsi" w:eastAsiaTheme="minorEastAsia" w:hAnsiTheme="minorHAnsi" w:cstheme="minorBidi"/>
+        <w:rFonts w:ascii="Arial" w:eastAsia="Arial" w:hAnsi="Arial"/>
         <w:sz w:val="22"/>
         <w:szCs w:val="22"/>
-        <w:lang w:val="en-US" w:eastAsia="en-US" w:bidi="ar-SA"/>
+        <w:lang w:val="en-US" w:eastAsia="Arial" w:bidi="ar-SA"/>
       </w:rPr>
     </w:rPrDefault>
     <w:pPrDefault>
@@ -2659,8 +2646,13 @@
       <w:numPr>
         <w:numId w:val="1"/>
       </w:numPr>
+      <w:spacing w:after="80" w:line="276" w:lineRule="auto"/>
       <w:contextualSpacing/>
     </w:pPr>
+    <w:rPr>
+      <w:rFonts w:ascii="Arial" w:hAnsi="Arial" w:eastAsia="Arial"/>
+      <w:sz w:val="22"/>
+    </w:rPr>
   </w:style>
   <w:style w:type="paragraph" w:styleId="ListBullet2">
     <w:name w:val="List Bullet 2"/>
@@ -2698,8 +2690,13 @@
       <w:numPr>
         <w:numId w:val="5"/>
       </w:numPr>
+      <w:spacing w:after="80" w:line="276" w:lineRule="auto"/>
       <w:contextualSpacing/>
     </w:pPr>
+    <w:rPr>
+      <w:rFonts w:ascii="Arial" w:hAnsi="Arial" w:eastAsia="Arial"/>
+      <w:sz w:val="22"/>
+    </w:rPr>
   </w:style>
   <w:style w:type="paragraph" w:styleId="ListNumber2">
     <w:name w:val="List Number 2"/>
@@ -2781,7 +2778,7 @@
       </w:tabs>
     </w:pPr>
     <w:rPr>
-      <w:rFonts w:ascii="Courier" w:hAnsi="Courier"/>
+      <w:rFonts w:ascii="Arial" w:hAnsi="Arial"/>
       <w:sz w:val="20"/>
       <w:szCs w:val="20"/>
     </w:rPr>
@@ -2793,7 +2790,7 @@
     <w:uiPriority w:val="99"/>
     <w:rsid w:val="0029639D"/>
     <w:rPr>
-      <w:rFonts w:ascii="Courier" w:hAnsi="Courier"/>
+      <w:rFonts w:ascii="Arial" w:hAnsi="Arial"/>
       <w:sz w:val="20"/>
       <w:szCs w:val="20"/>
     </w:rPr>

</xml_diff>

<commit_message>
Update report summary wording
</commit_message>
<xml_diff>
--- a/outputs/TENKI_sales_model_boss_report_google_docs.docx
+++ b/outputs/TENKI_sales_model_boss_report_google_docs.docx
@@ -26,12 +26,7 @@
     </w:p>
     <w:p>
       <w:r>
-        <w:t>This project builds an interactive model dashboard for analyzing and predicting historical Rakuten sales performance. The model estimates both sales value and quantity sold by learning from seasonality, Japanese holidays, Rakuten promotion events, and category-level sales behavior.</w:t>
-      </w:r>
-    </w:p>
-    <w:p>
-      <w:r>
-        <w:t>The main business goal is to move toward a future-facing tool that helps sellers prepare inventory before major demand changes, especially during Rakuten campaigns such as Shopping Marathon, Super Sale, Black Friday, Thanksgiving Festival, and 5/0 point days.</w:t>
+        <w:t>This project builds an interactive model dashboard for analyzing and predicting historical Rakuten sales performance. The model estimates both sales value and quantity sold by learning from seasonality, Japanese holidays, Rakuten promotion events, and category-level sales behavior. The main business goal is to move toward a future-facing tool that helps sellers prepare inventory before major demand changes, especially during Rakuten campaigns such as Shopping Marathon, Super Sale, Black Friday, Thanksgiving Festival, and 5/0 point days.</w:t>
       </w:r>
     </w:p>
     <w:p>
@@ -40,7 +35,20 @@
         <w:spacing w:after="80"/>
       </w:pPr>
       <w:r>
-        <w:t>Local dashboard: http://127.0.0.1:8877/?v=organized-dashboard</w:t>
+        <w:rPr>
+          <w:rFonts w:ascii="Arial" w:hAnsi="Arial"/>
+          <w:b/>
+        </w:rPr>
+        <w:t xml:space="preserve">Local dashboard: </w:t>
+      </w:r>
+      <w:r>
+        <w:rPr>
+          <w:rFonts w:ascii="Arial" w:hAnsi="Arial"/>
+          <w:b/>
+          <w:color w:val="1155CC"/>
+          <w:u w:val="single"/>
+        </w:rPr>
+        <w:t>http://127.0.0.1:8877/?v=organized-dashboard</w:t>
       </w:r>
     </w:p>
     <w:p>
@@ -49,7 +57,20 @@
         <w:spacing w:after="80"/>
       </w:pPr>
       <w:r>
-        <w:t>GitHub Pages: https://jasminehou07.github.io/tenki-past-sales-model/</w:t>
+        <w:rPr>
+          <w:rFonts w:ascii="Arial" w:hAnsi="Arial"/>
+          <w:b/>
+        </w:rPr>
+        <w:t xml:space="preserve">GitHub Pages: </w:t>
+      </w:r>
+      <w:r>
+        <w:rPr>
+          <w:rFonts w:ascii="Arial" w:hAnsi="Arial"/>
+          <w:b/>
+          <w:color w:val="1155CC"/>
+          <w:u w:val="single"/>
+        </w:rPr>
+        <w:t>https://jasminehou07.github.io/tenki-past-sales-model/</w:t>
       </w:r>
     </w:p>
     <w:p>
@@ -357,7 +378,7 @@
     <w:p/>
     <w:p>
       <w:r>
-        <w:t>Plain-English interpretation:</w:t>
+        <w:t>Interpretation:</w:t>
       </w:r>
     </w:p>
     <w:p>

</xml_diff>

<commit_message>
Use shareable model link in report
</commit_message>
<xml_diff>
--- a/outputs/TENKI_sales_model_boss_report_google_docs.docx
+++ b/outputs/TENKI_sales_model_boss_report_google_docs.docx
@@ -39,29 +39,7 @@
           <w:rFonts w:ascii="Arial" w:hAnsi="Arial"/>
           <w:b/>
         </w:rPr>
-        <w:t xml:space="preserve">Local dashboard: </w:t>
-      </w:r>
-      <w:r>
-        <w:rPr>
-          <w:rFonts w:ascii="Arial" w:hAnsi="Arial"/>
-          <w:b/>
-          <w:color w:val="1155CC"/>
-          <w:u w:val="single"/>
-        </w:rPr>
-        <w:t>http://127.0.0.1:8877/?v=organized-dashboard</w:t>
-      </w:r>
-    </w:p>
-    <w:p>
-      <w:pPr>
-        <w:pStyle w:val="ListBullet"/>
-        <w:spacing w:after="80"/>
-      </w:pPr>
-      <w:r>
-        <w:rPr>
-          <w:rFonts w:ascii="Arial" w:hAnsi="Arial"/>
-          <w:b/>
-        </w:rPr>
-        <w:t xml:space="preserve">GitHub Pages: </w:t>
+        <w:t xml:space="preserve">Interactive model link: </w:t>
       </w:r>
       <w:r>
         <w:rPr>

</xml_diff>

<commit_message>
Add reviewed promotions to report
</commit_message>
<xml_diff>
--- a/outputs/TENKI_sales_model_boss_report_google_docs.docx
+++ b/outputs/TENKI_sales_model_boss_report_google_docs.docx
@@ -725,7 +725,7 @@
     </w:p>
     <w:p>
       <w:r>
-        <w:t>The model currently uses promotions that showed stronger relationship with sales or quantity movement. These were selected using promotion regression/correlation analysis.</w:t>
+        <w:t>The table below compares promotions that were used in the model with additional promotions that were reviewed but not included. Promotions were kept when their relationship with sales or quantity movement was stronger in the regression/correlation analysis.</w:t>
       </w:r>
     </w:p>
     <w:tbl>
@@ -1182,11 +1182,291 @@
           </w:p>
         </w:tc>
       </w:tr>
+      <w:tr>
+        <w:tc>
+          <w:tcPr>
+            <w:tcW w:type="dxa" w:w="3200"/>
+          </w:tcPr>
+          <w:p>
+            <w:pPr>
+              <w:jc w:val="left"/>
+            </w:pPr>
+            <w:r>
+              <w:rPr>
+                <w:rFonts w:ascii="Arial" w:hAnsi="Arial"/>
+                <w:sz w:val="20"/>
+              </w:rPr>
+              <w:t>Wonderful Day</w:t>
+            </w:r>
+          </w:p>
+        </w:tc>
+        <w:tc>
+          <w:tcPr>
+            <w:tcW w:type="dxa" w:w="2200"/>
+          </w:tcPr>
+          <w:p>
+            <w:pPr>
+              <w:jc w:val="center"/>
+            </w:pPr>
+            <w:r>
+              <w:rPr>
+                <w:rFonts w:ascii="Arial" w:hAnsi="Arial"/>
+                <w:sz w:val="20"/>
+              </w:rPr>
+              <w:t>42.5%</w:t>
+            </w:r>
+          </w:p>
+        </w:tc>
+        <w:tc>
+          <w:tcPr>
+            <w:tcW w:type="dxa" w:w="2400"/>
+          </w:tcPr>
+          <w:p>
+            <w:pPr>
+              <w:jc w:val="center"/>
+            </w:pPr>
+            <w:r>
+              <w:rPr>
+                <w:rFonts w:ascii="Arial" w:hAnsi="Arial"/>
+                <w:sz w:val="20"/>
+              </w:rPr>
+              <w:t>17.7%</w:t>
+            </w:r>
+          </w:p>
+        </w:tc>
+        <w:tc>
+          <w:tcPr>
+            <w:tcW w:type="dxa" w:w="1560"/>
+          </w:tcPr>
+          <w:p>
+            <w:pPr>
+              <w:jc w:val="center"/>
+            </w:pPr>
+            <w:r>
+              <w:rPr>
+                <w:rFonts w:ascii="Arial" w:hAnsi="Arial"/>
+                <w:sz w:val="20"/>
+              </w:rPr>
+              <w:t>No</w:t>
+            </w:r>
+          </w:p>
+        </w:tc>
+      </w:tr>
+      <w:tr>
+        <w:tc>
+          <w:tcPr>
+            <w:tcW w:type="dxa" w:w="3200"/>
+          </w:tcPr>
+          <w:p>
+            <w:pPr>
+              <w:jc w:val="left"/>
+            </w:pPr>
+            <w:r>
+              <w:rPr>
+                <w:rFonts w:ascii="Arial" w:hAnsi="Arial"/>
+                <w:sz w:val="20"/>
+              </w:rPr>
+              <w:t>Rakuten Fashion sale</w:t>
+            </w:r>
+          </w:p>
+        </w:tc>
+        <w:tc>
+          <w:tcPr>
+            <w:tcW w:type="dxa" w:w="2200"/>
+          </w:tcPr>
+          <w:p>
+            <w:pPr>
+              <w:jc w:val="center"/>
+            </w:pPr>
+            <w:r>
+              <w:rPr>
+                <w:rFonts w:ascii="Arial" w:hAnsi="Arial"/>
+                <w:sz w:val="20"/>
+              </w:rPr>
+              <w:t>-12.5%</w:t>
+            </w:r>
+          </w:p>
+        </w:tc>
+        <w:tc>
+          <w:tcPr>
+            <w:tcW w:type="dxa" w:w="2400"/>
+          </w:tcPr>
+          <w:p>
+            <w:pPr>
+              <w:jc w:val="center"/>
+            </w:pPr>
+            <w:r>
+              <w:rPr>
+                <w:rFonts w:ascii="Arial" w:hAnsi="Arial"/>
+                <w:sz w:val="20"/>
+              </w:rPr>
+              <w:t>-7.0%</w:t>
+            </w:r>
+          </w:p>
+        </w:tc>
+        <w:tc>
+          <w:tcPr>
+            <w:tcW w:type="dxa" w:w="1560"/>
+          </w:tcPr>
+          <w:p>
+            <w:pPr>
+              <w:jc w:val="center"/>
+            </w:pPr>
+            <w:r>
+              <w:rPr>
+                <w:rFonts w:ascii="Arial" w:hAnsi="Arial"/>
+                <w:sz w:val="20"/>
+              </w:rPr>
+              <w:t>No</w:t>
+            </w:r>
+          </w:p>
+        </w:tc>
+      </w:tr>
+      <w:tr>
+        <w:tc>
+          <w:tcPr>
+            <w:tcW w:type="dxa" w:w="3200"/>
+          </w:tcPr>
+          <w:p>
+            <w:pPr>
+              <w:jc w:val="left"/>
+            </w:pPr>
+            <w:r>
+              <w:rPr>
+                <w:rFonts w:ascii="Arial" w:hAnsi="Arial"/>
+                <w:sz w:val="20"/>
+              </w:rPr>
+              <w:t>Sports win campaign</w:t>
+            </w:r>
+          </w:p>
+        </w:tc>
+        <w:tc>
+          <w:tcPr>
+            <w:tcW w:type="dxa" w:w="2200"/>
+          </w:tcPr>
+          <w:p>
+            <w:pPr>
+              <w:jc w:val="center"/>
+            </w:pPr>
+            <w:r>
+              <w:rPr>
+                <w:rFonts w:ascii="Arial" w:hAnsi="Arial"/>
+                <w:sz w:val="20"/>
+              </w:rPr>
+              <w:t>33.1%</w:t>
+            </w:r>
+          </w:p>
+        </w:tc>
+        <w:tc>
+          <w:tcPr>
+            <w:tcW w:type="dxa" w:w="2400"/>
+          </w:tcPr>
+          <w:p>
+            <w:pPr>
+              <w:jc w:val="center"/>
+            </w:pPr>
+            <w:r>
+              <w:rPr>
+                <w:rFonts w:ascii="Arial" w:hAnsi="Arial"/>
+                <w:sz w:val="20"/>
+              </w:rPr>
+              <w:t>11.4%</w:t>
+            </w:r>
+          </w:p>
+        </w:tc>
+        <w:tc>
+          <w:tcPr>
+            <w:tcW w:type="dxa" w:w="1560"/>
+          </w:tcPr>
+          <w:p>
+            <w:pPr>
+              <w:jc w:val="center"/>
+            </w:pPr>
+            <w:r>
+              <w:rPr>
+                <w:rFonts w:ascii="Arial" w:hAnsi="Arial"/>
+                <w:sz w:val="20"/>
+              </w:rPr>
+              <w:t>No</w:t>
+            </w:r>
+          </w:p>
+        </w:tc>
+      </w:tr>
+      <w:tr>
+        <w:tc>
+          <w:tcPr>
+            <w:tcW w:type="dxa" w:w="3200"/>
+          </w:tcPr>
+          <w:p>
+            <w:pPr>
+              <w:jc w:val="left"/>
+            </w:pPr>
+            <w:r>
+              <w:rPr>
+                <w:rFonts w:ascii="Arial" w:hAnsi="Arial"/>
+                <w:sz w:val="20"/>
+              </w:rPr>
+              <w:t>18th Ichiba Day</w:t>
+            </w:r>
+          </w:p>
+        </w:tc>
+        <w:tc>
+          <w:tcPr>
+            <w:tcW w:type="dxa" w:w="2200"/>
+          </w:tcPr>
+          <w:p>
+            <w:pPr>
+              <w:jc w:val="center"/>
+            </w:pPr>
+            <w:r>
+              <w:rPr>
+                <w:rFonts w:ascii="Arial" w:hAnsi="Arial"/>
+                <w:sz w:val="20"/>
+              </w:rPr>
+              <w:t>-10.3%</w:t>
+            </w:r>
+          </w:p>
+        </w:tc>
+        <w:tc>
+          <w:tcPr>
+            <w:tcW w:type="dxa" w:w="2400"/>
+          </w:tcPr>
+          <w:p>
+            <w:pPr>
+              <w:jc w:val="center"/>
+            </w:pPr>
+            <w:r>
+              <w:rPr>
+                <w:rFonts w:ascii="Arial" w:hAnsi="Arial"/>
+                <w:sz w:val="20"/>
+              </w:rPr>
+              <w:t>-5.5%</w:t>
+            </w:r>
+          </w:p>
+        </w:tc>
+        <w:tc>
+          <w:tcPr>
+            <w:tcW w:type="dxa" w:w="1560"/>
+          </w:tcPr>
+          <w:p>
+            <w:pPr>
+              <w:jc w:val="center"/>
+            </w:pPr>
+            <w:r>
+              <w:rPr>
+                <w:rFonts w:ascii="Arial" w:hAnsi="Arial"/>
+                <w:sz w:val="20"/>
+              </w:rPr>
+              <w:t>No</w:t>
+            </w:r>
+          </w:p>
+        </w:tc>
+      </w:tr>
     </w:tbl>
     <w:p/>
     <w:p>
       <w:r>
-        <w:t>These results suggest that promotion timing and promotion type are important for predicting fluctuations, especially for quantity sold and inventory planning.</w:t>
+        <w:t>These results suggest that promotion timing and promotion type are important for predicting fluctuations, especially for quantity sold and inventory planning. Promotions marked "No" were still analyzed, but their measured relationship was weaker or less consistent, so they were not used as primary model features.</w:t>
       </w:r>
     </w:p>
     <w:p>

</xml_diff>

<commit_message>
Remove extra report sections
</commit_message>
<xml_diff>
--- a/outputs/TENKI_sales_model_boss_report_google_docs.docx
+++ b/outputs/TENKI_sales_model_boss_report_google_docs.docx
@@ -1603,304 +1603,6 @@
         <w:pStyle w:val="Heading1"/>
       </w:pPr>
       <w:r>
-        <w:t>Item Name File Needed</w:t>
-      </w:r>
-    </w:p>
-    <w:p>
-      <w:r>
-        <w:t>The next important file from the team should map item IDs to readable item names or FTP titles.</w:t>
-      </w:r>
-    </w:p>
-    <w:tbl>
-      <w:tblPr>
-        <w:tblStyle w:val="TableGrid"/>
-        <w:tblW w:type="dxa" w:w="9360"/>
-        <w:tblLayout w:type="fixed"/>
-        <w:tblLook w:firstColumn="1" w:firstRow="1" w:lastColumn="0" w:lastRow="0" w:noHBand="0" w:noVBand="1" w:val="04A0"/>
-        <w:jc w:val="left"/>
-        <w:tblBorders>
-          <w:top w:val="single" w:sz="4" w:space="0" w:color="DADCE0"/>
-          <w:left w:val="single" w:sz="4" w:space="0" w:color="DADCE0"/>
-          <w:bottom w:val="single" w:sz="4" w:space="0" w:color="DADCE0"/>
-          <w:right w:val="single" w:sz="4" w:space="0" w:color="DADCE0"/>
-          <w:insideH w:val="single" w:sz="4" w:space="0" w:color="DADCE0"/>
-          <w:insideV w:val="single" w:sz="4" w:space="0" w:color="DADCE0"/>
-        </w:tblBorders>
-      </w:tblPr>
-      <w:tblGrid>
-        <w:gridCol w:w="3000"/>
-        <w:gridCol w:w="6360"/>
-      </w:tblGrid>
-      <w:tr>
-        <w:tc>
-          <w:tcPr>
-            <w:tcW w:type="dxa" w:w="3000"/>
-            <w:vAlign w:val="center"/>
-            <w:shd w:fill="F8F9FA"/>
-          </w:tcPr>
-          <w:p>
-            <w:pPr>
-              <w:jc w:val="left"/>
-            </w:pPr>
-            <w:r>
-              <w:rPr>
-                <w:rFonts w:ascii="Arial" w:hAnsi="Arial"/>
-                <w:b/>
-                <w:sz w:val="20"/>
-              </w:rPr>
-              <w:t>Column</w:t>
-            </w:r>
-          </w:p>
-        </w:tc>
-        <w:tc>
-          <w:tcPr>
-            <w:tcW w:type="dxa" w:w="6360"/>
-            <w:vAlign w:val="center"/>
-            <w:shd w:fill="F8F9FA"/>
-          </w:tcPr>
-          <w:p>
-            <w:pPr>
-              <w:jc w:val="center"/>
-            </w:pPr>
-            <w:r>
-              <w:rPr>
-                <w:rFonts w:ascii="Arial" w:hAnsi="Arial"/>
-                <w:b/>
-                <w:sz w:val="20"/>
-              </w:rPr>
-              <w:t>Why It Helps</w:t>
-            </w:r>
-          </w:p>
-        </w:tc>
-      </w:tr>
-      <w:tr>
-        <w:tc>
-          <w:tcPr>
-            <w:tcW w:type="dxa" w:w="3000"/>
-          </w:tcPr>
-          <w:p>
-            <w:pPr>
-              <w:jc w:val="left"/>
-            </w:pPr>
-            <w:r>
-              <w:rPr>
-                <w:rFonts w:ascii="Arial" w:hAnsi="Arial"/>
-                <w:sz w:val="20"/>
-              </w:rPr>
-              <w:t>item_id</w:t>
-            </w:r>
-          </w:p>
-        </w:tc>
-        <w:tc>
-          <w:tcPr>
-            <w:tcW w:type="dxa" w:w="6360"/>
-          </w:tcPr>
-          <w:p>
-            <w:pPr>
-              <w:jc w:val="center"/>
-            </w:pPr>
-            <w:r>
-              <w:rPr>
-                <w:rFonts w:ascii="Arial" w:hAnsi="Arial"/>
-                <w:sz w:val="20"/>
-              </w:rPr>
-              <w:t>Connects the file to the current TENKI item IDs.</w:t>
-            </w:r>
-          </w:p>
-        </w:tc>
-      </w:tr>
-      <w:tr>
-        <w:tc>
-          <w:tcPr>
-            <w:tcW w:type="dxa" w:w="3000"/>
-          </w:tcPr>
-          <w:p>
-            <w:pPr>
-              <w:jc w:val="left"/>
-            </w:pPr>
-            <w:r>
-              <w:rPr>
-                <w:rFonts w:ascii="Arial" w:hAnsi="Arial"/>
-                <w:sz w:val="20"/>
-              </w:rPr>
-              <w:t>item_name or ftp_title</w:t>
-            </w:r>
-          </w:p>
-        </w:tc>
-        <w:tc>
-          <w:tcPr>
-            <w:tcW w:type="dxa" w:w="6360"/>
-          </w:tcPr>
-          <w:p>
-            <w:pPr>
-              <w:jc w:val="center"/>
-            </w:pPr>
-            <w:r>
-              <w:rPr>
-                <w:rFonts w:ascii="Arial" w:hAnsi="Arial"/>
-                <w:sz w:val="20"/>
-              </w:rPr>
-              <w:t>Lets the dashboard show actual product names.</w:t>
-            </w:r>
-          </w:p>
-        </w:tc>
-      </w:tr>
-      <w:tr>
-        <w:tc>
-          <w:tcPr>
-            <w:tcW w:type="dxa" w:w="3000"/>
-          </w:tcPr>
-          <w:p>
-            <w:pPr>
-              <w:jc w:val="left"/>
-            </w:pPr>
-            <w:r>
-              <w:rPr>
-                <w:rFonts w:ascii="Arial" w:hAnsi="Arial"/>
-                <w:sz w:val="20"/>
-              </w:rPr>
-              <w:t>genre_id</w:t>
-            </w:r>
-          </w:p>
-        </w:tc>
-        <w:tc>
-          <w:tcPr>
-            <w:tcW w:type="dxa" w:w="6360"/>
-          </w:tcPr>
-          <w:p>
-            <w:pPr>
-              <w:jc w:val="center"/>
-            </w:pPr>
-            <w:r>
-              <w:rPr>
-                <w:rFonts w:ascii="Arial" w:hAnsi="Arial"/>
-                <w:sz w:val="20"/>
-              </w:rPr>
-              <w:t>Confirms the item belongs to the right category.</w:t>
-            </w:r>
-          </w:p>
-        </w:tc>
-      </w:tr>
-      <w:tr>
-        <w:tc>
-          <w:tcPr>
-            <w:tcW w:type="dxa" w:w="3000"/>
-          </w:tcPr>
-          <w:p>
-            <w:pPr>
-              <w:jc w:val="left"/>
-            </w:pPr>
-            <w:r>
-              <w:rPr>
-                <w:rFonts w:ascii="Arial" w:hAnsi="Arial"/>
-                <w:sz w:val="20"/>
-              </w:rPr>
-              <w:t>shop_id or shop_code</w:t>
-            </w:r>
-          </w:p>
-        </w:tc>
-        <w:tc>
-          <w:tcPr>
-            <w:tcW w:type="dxa" w:w="6360"/>
-          </w:tcPr>
-          <w:p>
-            <w:pPr>
-              <w:jc w:val="center"/>
-            </w:pPr>
-            <w:r>
-              <w:rPr>
-                <w:rFonts w:ascii="Arial" w:hAnsi="Arial"/>
-                <w:sz w:val="20"/>
-              </w:rPr>
-              <w:t>Allows seller/store-level modeling later.</w:t>
-            </w:r>
-          </w:p>
-        </w:tc>
-      </w:tr>
-      <w:tr>
-        <w:tc>
-          <w:tcPr>
-            <w:tcW w:type="dxa" w:w="3000"/>
-          </w:tcPr>
-          <w:p>
-            <w:pPr>
-              <w:jc w:val="left"/>
-            </w:pPr>
-            <w:r>
-              <w:rPr>
-                <w:rFonts w:ascii="Arial" w:hAnsi="Arial"/>
-                <w:sz w:val="20"/>
-              </w:rPr>
-              <w:t>price or list_price</w:t>
-            </w:r>
-          </w:p>
-        </w:tc>
-        <w:tc>
-          <w:tcPr>
-            <w:tcW w:type="dxa" w:w="6360"/>
-          </w:tcPr>
-          <w:p>
-            <w:pPr>
-              <w:jc w:val="center"/>
-            </w:pPr>
-            <w:r>
-              <w:rPr>
-                <w:rFonts w:ascii="Arial" w:hAnsi="Arial"/>
-                <w:sz w:val="20"/>
-              </w:rPr>
-              <w:t>Helps model demand changes from price.</w:t>
-            </w:r>
-          </w:p>
-        </w:tc>
-      </w:tr>
-      <w:tr>
-        <w:tc>
-          <w:tcPr>
-            <w:tcW w:type="dxa" w:w="3000"/>
-          </w:tcPr>
-          <w:p>
-            <w:pPr>
-              <w:jc w:val="left"/>
-            </w:pPr>
-            <w:r>
-              <w:rPr>
-                <w:rFonts w:ascii="Arial" w:hAnsi="Arial"/>
-                <w:sz w:val="20"/>
-              </w:rPr>
-              <w:t>JAN / SKU / product code</w:t>
-            </w:r>
-          </w:p>
-        </w:tc>
-        <w:tc>
-          <w:tcPr>
-            <w:tcW w:type="dxa" w:w="6360"/>
-          </w:tcPr>
-          <w:p>
-            <w:pPr>
-              <w:jc w:val="center"/>
-            </w:pPr>
-            <w:r>
-              <w:rPr>
-                <w:rFonts w:ascii="Arial" w:hAnsi="Arial"/>
-                <w:sz w:val="20"/>
-              </w:rPr>
-              <w:t>Helps identify the same product across files.</w:t>
-            </w:r>
-          </w:p>
-        </w:tc>
-      </w:tr>
-    </w:tbl>
-    <w:p/>
-    <w:p>
-      <w:r>
-        <w:t>Once this file is available, the dashboard can replace fallback item labels with real product names and support more useful item-level reporting.</w:t>
-      </w:r>
-    </w:p>
-    <w:p>
-      <w:pPr>
-        <w:pStyle w:val="Heading1"/>
-      </w:pPr>
-      <w:r>
         <w:t>Recommended Next Steps</w:t>
       </w:r>
     </w:p>
@@ -1965,59 +1667,6 @@
       </w:pPr>
       <w:r>
         <w:t>Convert this report into a short boss-facing PDF or slide deck after item names are added.</w:t>
-      </w:r>
-    </w:p>
-    <w:p>
-      <w:pPr>
-        <w:pStyle w:val="Heading1"/>
-      </w:pPr>
-      <w:r>
-        <w:t>Suggested Boss Talking Points</w:t>
-      </w:r>
-    </w:p>
-    <w:p>
-      <w:pPr>
-        <w:pStyle w:val="ListBullet"/>
-        <w:spacing w:after="80"/>
-      </w:pPr>
-      <w:r>
-        <w:t>The model already captures broad sales and quantity patterns with R2 around 0.86.</w:t>
-      </w:r>
-    </w:p>
-    <w:p>
-      <w:pPr>
-        <w:pStyle w:val="ListBullet"/>
-        <w:spacing w:after="80"/>
-      </w:pPr>
-      <w:r>
-        <w:t>Promotion events clearly matter and should be included in any future demand forecast.</w:t>
-      </w:r>
-    </w:p>
-    <w:p>
-      <w:pPr>
-        <w:pStyle w:val="ListBullet"/>
-        <w:spacing w:after="80"/>
-      </w:pPr>
-      <w:r>
-        <w:t>The dashboard can estimate how many units sellers should prepare for a selected date range.</w:t>
-      </w:r>
-    </w:p>
-    <w:p>
-      <w:pPr>
-        <w:pStyle w:val="ListBullet"/>
-        <w:spacing w:after="80"/>
-      </w:pPr>
-      <w:r>
-        <w:t>Accuracy is promising for a first backtesting tool, but production forecasting needs better product, price, and stock data.</w:t>
-      </w:r>
-    </w:p>
-    <w:p>
-      <w:pPr>
-        <w:pStyle w:val="ListBullet"/>
-        <w:spacing w:after="80"/>
-      </w:pPr>
-      <w:r>
-        <w:t>The next highest-value improvement is mapping item IDs to real item names or FTP titles.</w:t>
       </w:r>
     </w:p>
     <w:sectPr>

</xml_diff>

<commit_message>
Refocus report next steps on client forecasting
</commit_message>
<xml_diff>
--- a/outputs/TENKI_sales_model_boss_report_google_docs.docx
+++ b/outputs/TENKI_sales_model_boss_report_google_docs.docx
@@ -1612,7 +1612,7 @@
         <w:spacing w:after="80"/>
       </w:pPr>
       <w:r>
-        <w:t>Add the item-name / FTP-title file and update the item dropdown.</w:t>
+        <w:t>Build the next version of the model to predict future client sales, not only backtest past sales.</w:t>
       </w:r>
     </w:p>
     <w:p>
@@ -1621,7 +1621,7 @@
         <w:spacing w:after="80"/>
       </w:pPr>
       <w:r>
-        <w:t>Add price, discount, coupon, and point-back features.</w:t>
+        <w:t>Add client-specific inputs such as store, product, category, historical sales, quantity sold, and promotion participation.</w:t>
       </w:r>
     </w:p>
     <w:p>
@@ -1630,7 +1630,7 @@
         <w:spacing w:after="80"/>
       </w:pPr>
       <w:r>
-        <w:t>Add stockout or inventory availability data if available.</w:t>
+        <w:t>Add future-known business drivers, especially Rakuten promotion calendar dates, point multipliers, coupons, discounts, and holiday timing.</w:t>
       </w:r>
     </w:p>
     <w:p>
@@ -1639,7 +1639,7 @@
         <w:spacing w:after="80"/>
       </w:pPr>
       <w:r>
-        <w:t>Build a future promotion calendar input.</w:t>
+        <w:t>Add product and pricing details so the model can forecast at a more useful item or client level.</w:t>
       </w:r>
     </w:p>
     <w:p>
@@ -1648,7 +1648,7 @@
         <w:spacing w:after="80"/>
       </w:pPr>
       <w:r>
-        <w:t>Create client/store-specific model views once seller identifiers are available.</w:t>
+        <w:t>Validate the future forecast by training on earlier periods and testing on later unseen periods before using it for client planning.</w:t>
       </w:r>
     </w:p>
     <w:p>
@@ -1657,7 +1657,7 @@
         <w:spacing w:after="80"/>
       </w:pPr>
       <w:r>
-        <w:t>Calibrate confidence ranges using true forecast error, not only display caps.</w:t>
+        <w:t>Turn the output into a client-ready planning view that shows predicted sales, units to prepare, confidence range, and categories/items that need caution.</w:t>
       </w:r>
     </w:p>
     <w:p>
@@ -1666,7 +1666,7 @@
         <w:spacing w:after="80"/>
       </w:pPr>
       <w:r>
-        <w:t>Convert this report into a short boss-facing PDF or slide deck after item names are added.</w:t>
+        <w:t>Use this current dashboard as the backtesting and explanation layer for why the future forecasting model can be trusted.</w:t>
       </w:r>
     </w:p>
     <w:sectPr>

</xml_diff>

<commit_message>
Shorten report next steps plan
</commit_message>
<xml_diff>
--- a/outputs/TENKI_sales_model_boss_report_google_docs.docx
+++ b/outputs/TENKI_sales_model_boss_report_google_docs.docx
@@ -1621,7 +1621,7 @@
         <w:spacing w:after="80"/>
       </w:pPr>
       <w:r>
-        <w:t>Add client-specific inputs such as store, product, category, historical sales, quantity sold, and promotion participation.</w:t>
+        <w:t>Add client-specific product, store, historical sales, quantity, and promotion participation data.</w:t>
       </w:r>
     </w:p>
     <w:p>
@@ -1630,16 +1630,7 @@
         <w:spacing w:after="80"/>
       </w:pPr>
       <w:r>
-        <w:t>Add future-known business drivers, especially Rakuten promotion calendar dates, point multipliers, coupons, discounts, and holiday timing.</w:t>
-      </w:r>
-    </w:p>
-    <w:p>
-      <w:pPr>
-        <w:pStyle w:val="ListNumber"/>
-        <w:spacing w:after="80"/>
-      </w:pPr>
-      <w:r>
-        <w:t>Add product and pricing details so the model can forecast at a more useful item or client level.</w:t>
+        <w:t>Include future-known drivers such as Rakuten promotion dates, point multipliers, coupons, discounts, holidays, and pricing changes.</w:t>
       </w:r>
     </w:p>
     <w:p>
@@ -1657,16 +1648,7 @@
         <w:spacing w:after="80"/>
       </w:pPr>
       <w:r>
-        <w:t>Turn the output into a client-ready planning view that shows predicted sales, units to prepare, confidence range, and categories/items that need caution.</w:t>
-      </w:r>
-    </w:p>
-    <w:p>
-      <w:pPr>
-        <w:pStyle w:val="ListNumber"/>
-        <w:spacing w:after="80"/>
-      </w:pPr>
-      <w:r>
-        <w:t>Use this current dashboard as the backtesting and explanation layer for why the future forecasting model can be trusted.</w:t>
+        <w:t>Turn the output into a client-ready planning view showing predicted sales, units to prepare, confidence range, and caution areas.</w:t>
       </w:r>
     </w:p>
     <w:sectPr>

</xml_diff>

<commit_message>
Add promotion correlation to report
</commit_message>
<xml_diff>
--- a/outputs/TENKI_sales_model_boss_report_google_docs.docx
+++ b/outputs/TENKI_sales_model_boss_report_google_docs.docx
@@ -745,15 +745,16 @@
         </w:tblBorders>
       </w:tblPr>
       <w:tblGrid>
-        <w:gridCol w:w="3200"/>
+        <w:gridCol w:w="2700"/>
+        <w:gridCol w:w="1400"/>
+        <w:gridCol w:w="1900"/>
         <w:gridCol w:w="2200"/>
-        <w:gridCol w:w="2400"/>
-        <w:gridCol w:w="1560"/>
+        <w:gridCol w:w="1160"/>
       </w:tblGrid>
       <w:tr>
         <w:tc>
           <w:tcPr>
-            <w:tcW w:type="dxa" w:w="3200"/>
+            <w:tcW w:type="dxa" w:w="2700"/>
             <w:vAlign w:val="center"/>
             <w:shd w:fill="F8F9FA"/>
           </w:tcPr>
@@ -773,7 +774,27 @@
         </w:tc>
         <w:tc>
           <w:tcPr>
-            <w:tcW w:type="dxa" w:w="2200"/>
+            <w:tcW w:type="dxa" w:w="1400"/>
+            <w:vAlign w:val="center"/>
+            <w:shd w:fill="F8F9FA"/>
+          </w:tcPr>
+          <w:p>
+            <w:pPr>
+              <w:jc w:val="center"/>
+            </w:pPr>
+            <w:r>
+              <w:rPr>
+                <w:rFonts w:ascii="Arial" w:hAnsi="Arial"/>
+                <w:b/>
+                <w:sz w:val="20"/>
+              </w:rPr>
+              <w:t>Correlation</w:t>
+            </w:r>
+          </w:p>
+        </w:tc>
+        <w:tc>
+          <w:tcPr>
+            <w:tcW w:type="dxa" w:w="1900"/>
             <w:vAlign w:val="center"/>
             <w:shd w:fill="F8F9FA"/>
           </w:tcPr>
@@ -793,7 +814,7 @@
         </w:tc>
         <w:tc>
           <w:tcPr>
-            <w:tcW w:type="dxa" w:w="2400"/>
+            <w:tcW w:type="dxa" w:w="2200"/>
             <w:vAlign w:val="center"/>
             <w:shd w:fill="F8F9FA"/>
           </w:tcPr>
@@ -813,7 +834,7 @@
         </w:tc>
         <w:tc>
           <w:tcPr>
-            <w:tcW w:type="dxa" w:w="1560"/>
+            <w:tcW w:type="dxa" w:w="1160"/>
             <w:vAlign w:val="center"/>
             <w:shd w:fill="F8F9FA"/>
           </w:tcPr>
@@ -835,7 +856,7 @@
       <w:tr>
         <w:tc>
           <w:tcPr>
-            <w:tcW w:type="dxa" w:w="3200"/>
+            <w:tcW w:type="dxa" w:w="2700"/>
           </w:tcPr>
           <w:p>
             <w:pPr>
@@ -852,7 +873,24 @@
         </w:tc>
         <w:tc>
           <w:tcPr>
-            <w:tcW w:type="dxa" w:w="2200"/>
+            <w:tcW w:type="dxa" w:w="1400"/>
+          </w:tcPr>
+          <w:p>
+            <w:pPr>
+              <w:jc w:val="center"/>
+            </w:pPr>
+            <w:r>
+              <w:rPr>
+                <w:rFonts w:ascii="Arial" w:hAnsi="Arial"/>
+                <w:sz w:val="20"/>
+              </w:rPr>
+              <w:t>0.218</w:t>
+            </w:r>
+          </w:p>
+        </w:tc>
+        <w:tc>
+          <w:tcPr>
+            <w:tcW w:type="dxa" w:w="1900"/>
           </w:tcPr>
           <w:p>
             <w:pPr>
@@ -869,7 +907,7 @@
         </w:tc>
         <w:tc>
           <w:tcPr>
-            <w:tcW w:type="dxa" w:w="2400"/>
+            <w:tcW w:type="dxa" w:w="2200"/>
           </w:tcPr>
           <w:p>
             <w:pPr>
@@ -886,7 +924,7 @@
         </w:tc>
         <w:tc>
           <w:tcPr>
-            <w:tcW w:type="dxa" w:w="1560"/>
+            <w:tcW w:type="dxa" w:w="1160"/>
           </w:tcPr>
           <w:p>
             <w:pPr>
@@ -905,7 +943,7 @@
       <w:tr>
         <w:tc>
           <w:tcPr>
-            <w:tcW w:type="dxa" w:w="3200"/>
+            <w:tcW w:type="dxa" w:w="2700"/>
           </w:tcPr>
           <w:p>
             <w:pPr>
@@ -922,7 +960,24 @@
         </w:tc>
         <w:tc>
           <w:tcPr>
-            <w:tcW w:type="dxa" w:w="2200"/>
+            <w:tcW w:type="dxa" w:w="1400"/>
+          </w:tcPr>
+          <w:p>
+            <w:pPr>
+              <w:jc w:val="center"/>
+            </w:pPr>
+            <w:r>
+              <w:rPr>
+                <w:rFonts w:ascii="Arial" w:hAnsi="Arial"/>
+                <w:sz w:val="20"/>
+              </w:rPr>
+              <w:t>0.140</w:t>
+            </w:r>
+          </w:p>
+        </w:tc>
+        <w:tc>
+          <w:tcPr>
+            <w:tcW w:type="dxa" w:w="1900"/>
           </w:tcPr>
           <w:p>
             <w:pPr>
@@ -939,7 +994,7 @@
         </w:tc>
         <w:tc>
           <w:tcPr>
-            <w:tcW w:type="dxa" w:w="2400"/>
+            <w:tcW w:type="dxa" w:w="2200"/>
           </w:tcPr>
           <w:p>
             <w:pPr>
@@ -956,7 +1011,7 @@
         </w:tc>
         <w:tc>
           <w:tcPr>
-            <w:tcW w:type="dxa" w:w="1560"/>
+            <w:tcW w:type="dxa" w:w="1160"/>
           </w:tcPr>
           <w:p>
             <w:pPr>
@@ -975,7 +1030,7 @@
       <w:tr>
         <w:tc>
           <w:tcPr>
-            <w:tcW w:type="dxa" w:w="3200"/>
+            <w:tcW w:type="dxa" w:w="2700"/>
           </w:tcPr>
           <w:p>
             <w:pPr>
@@ -992,7 +1047,24 @@
         </w:tc>
         <w:tc>
           <w:tcPr>
-            <w:tcW w:type="dxa" w:w="2200"/>
+            <w:tcW w:type="dxa" w:w="1400"/>
+          </w:tcPr>
+          <w:p>
+            <w:pPr>
+              <w:jc w:val="center"/>
+            </w:pPr>
+            <w:r>
+              <w:rPr>
+                <w:rFonts w:ascii="Arial" w:hAnsi="Arial"/>
+                <w:sz w:val="20"/>
+              </w:rPr>
+              <w:t>0.084</w:t>
+            </w:r>
+          </w:p>
+        </w:tc>
+        <w:tc>
+          <w:tcPr>
+            <w:tcW w:type="dxa" w:w="1900"/>
           </w:tcPr>
           <w:p>
             <w:pPr>
@@ -1009,7 +1081,7 @@
         </w:tc>
         <w:tc>
           <w:tcPr>
-            <w:tcW w:type="dxa" w:w="2400"/>
+            <w:tcW w:type="dxa" w:w="2200"/>
           </w:tcPr>
           <w:p>
             <w:pPr>
@@ -1026,7 +1098,7 @@
         </w:tc>
         <w:tc>
           <w:tcPr>
-            <w:tcW w:type="dxa" w:w="1560"/>
+            <w:tcW w:type="dxa" w:w="1160"/>
           </w:tcPr>
           <w:p>
             <w:pPr>
@@ -1045,7 +1117,7 @@
       <w:tr>
         <w:tc>
           <w:tcPr>
-            <w:tcW w:type="dxa" w:w="3200"/>
+            <w:tcW w:type="dxa" w:w="2700"/>
           </w:tcPr>
           <w:p>
             <w:pPr>
@@ -1062,7 +1134,24 @@
         </w:tc>
         <w:tc>
           <w:tcPr>
-            <w:tcW w:type="dxa" w:w="2200"/>
+            <w:tcW w:type="dxa" w:w="1400"/>
+          </w:tcPr>
+          <w:p>
+            <w:pPr>
+              <w:jc w:val="center"/>
+            </w:pPr>
+            <w:r>
+              <w:rPr>
+                <w:rFonts w:ascii="Arial" w:hAnsi="Arial"/>
+                <w:sz w:val="20"/>
+              </w:rPr>
+              <w:t>0.059</w:t>
+            </w:r>
+          </w:p>
+        </w:tc>
+        <w:tc>
+          <w:tcPr>
+            <w:tcW w:type="dxa" w:w="1900"/>
           </w:tcPr>
           <w:p>
             <w:pPr>
@@ -1079,7 +1168,7 @@
         </w:tc>
         <w:tc>
           <w:tcPr>
-            <w:tcW w:type="dxa" w:w="2400"/>
+            <w:tcW w:type="dxa" w:w="2200"/>
           </w:tcPr>
           <w:p>
             <w:pPr>
@@ -1096,7 +1185,7 @@
         </w:tc>
         <w:tc>
           <w:tcPr>
-            <w:tcW w:type="dxa" w:w="1560"/>
+            <w:tcW w:type="dxa" w:w="1160"/>
           </w:tcPr>
           <w:p>
             <w:pPr>
@@ -1115,7 +1204,7 @@
       <w:tr>
         <w:tc>
           <w:tcPr>
-            <w:tcW w:type="dxa" w:w="3200"/>
+            <w:tcW w:type="dxa" w:w="2700"/>
           </w:tcPr>
           <w:p>
             <w:pPr>
@@ -1132,7 +1221,24 @@
         </w:tc>
         <w:tc>
           <w:tcPr>
-            <w:tcW w:type="dxa" w:w="2200"/>
+            <w:tcW w:type="dxa" w:w="1400"/>
+          </w:tcPr>
+          <w:p>
+            <w:pPr>
+              <w:jc w:val="center"/>
+            </w:pPr>
+            <w:r>
+              <w:rPr>
+                <w:rFonts w:ascii="Arial" w:hAnsi="Arial"/>
+                <w:sz w:val="20"/>
+              </w:rPr>
+              <w:t>0.051</w:t>
+            </w:r>
+          </w:p>
+        </w:tc>
+        <w:tc>
+          <w:tcPr>
+            <w:tcW w:type="dxa" w:w="1900"/>
           </w:tcPr>
           <w:p>
             <w:pPr>
@@ -1149,7 +1255,7 @@
         </w:tc>
         <w:tc>
           <w:tcPr>
-            <w:tcW w:type="dxa" w:w="2400"/>
+            <w:tcW w:type="dxa" w:w="2200"/>
           </w:tcPr>
           <w:p>
             <w:pPr>
@@ -1166,7 +1272,7 @@
         </w:tc>
         <w:tc>
           <w:tcPr>
-            <w:tcW w:type="dxa" w:w="1560"/>
+            <w:tcW w:type="dxa" w:w="1160"/>
           </w:tcPr>
           <w:p>
             <w:pPr>
@@ -1185,7 +1291,7 @@
       <w:tr>
         <w:tc>
           <w:tcPr>
-            <w:tcW w:type="dxa" w:w="3200"/>
+            <w:tcW w:type="dxa" w:w="2700"/>
           </w:tcPr>
           <w:p>
             <w:pPr>
@@ -1202,7 +1308,24 @@
         </w:tc>
         <w:tc>
           <w:tcPr>
-            <w:tcW w:type="dxa" w:w="2200"/>
+            <w:tcW w:type="dxa" w:w="1400"/>
+          </w:tcPr>
+          <w:p>
+            <w:pPr>
+              <w:jc w:val="center"/>
+            </w:pPr>
+            <w:r>
+              <w:rPr>
+                <w:rFonts w:ascii="Arial" w:hAnsi="Arial"/>
+                <w:sz w:val="20"/>
+              </w:rPr>
+              <w:t>0.020</w:t>
+            </w:r>
+          </w:p>
+        </w:tc>
+        <w:tc>
+          <w:tcPr>
+            <w:tcW w:type="dxa" w:w="1900"/>
           </w:tcPr>
           <w:p>
             <w:pPr>
@@ -1219,7 +1342,7 @@
         </w:tc>
         <w:tc>
           <w:tcPr>
-            <w:tcW w:type="dxa" w:w="2400"/>
+            <w:tcW w:type="dxa" w:w="2200"/>
           </w:tcPr>
           <w:p>
             <w:pPr>
@@ -1236,7 +1359,7 @@
         </w:tc>
         <w:tc>
           <w:tcPr>
-            <w:tcW w:type="dxa" w:w="1560"/>
+            <w:tcW w:type="dxa" w:w="1160"/>
           </w:tcPr>
           <w:p>
             <w:pPr>
@@ -1255,7 +1378,7 @@
       <w:tr>
         <w:tc>
           <w:tcPr>
-            <w:tcW w:type="dxa" w:w="3200"/>
+            <w:tcW w:type="dxa" w:w="2700"/>
           </w:tcPr>
           <w:p>
             <w:pPr>
@@ -1272,7 +1395,24 @@
         </w:tc>
         <w:tc>
           <w:tcPr>
-            <w:tcW w:type="dxa" w:w="2200"/>
+            <w:tcW w:type="dxa" w:w="1400"/>
+          </w:tcPr>
+          <w:p>
+            <w:pPr>
+              <w:jc w:val="center"/>
+            </w:pPr>
+            <w:r>
+              <w:rPr>
+                <w:rFonts w:ascii="Arial" w:hAnsi="Arial"/>
+                <w:sz w:val="20"/>
+              </w:rPr>
+              <w:t>0.014</w:t>
+            </w:r>
+          </w:p>
+        </w:tc>
+        <w:tc>
+          <w:tcPr>
+            <w:tcW w:type="dxa" w:w="1900"/>
           </w:tcPr>
           <w:p>
             <w:pPr>
@@ -1289,7 +1429,7 @@
         </w:tc>
         <w:tc>
           <w:tcPr>
-            <w:tcW w:type="dxa" w:w="2400"/>
+            <w:tcW w:type="dxa" w:w="2200"/>
           </w:tcPr>
           <w:p>
             <w:pPr>
@@ -1306,7 +1446,7 @@
         </w:tc>
         <w:tc>
           <w:tcPr>
-            <w:tcW w:type="dxa" w:w="1560"/>
+            <w:tcW w:type="dxa" w:w="1160"/>
           </w:tcPr>
           <w:p>
             <w:pPr>
@@ -1325,7 +1465,7 @@
       <w:tr>
         <w:tc>
           <w:tcPr>
-            <w:tcW w:type="dxa" w:w="3200"/>
+            <w:tcW w:type="dxa" w:w="2700"/>
           </w:tcPr>
           <w:p>
             <w:pPr>
@@ -1342,7 +1482,24 @@
         </w:tc>
         <w:tc>
           <w:tcPr>
-            <w:tcW w:type="dxa" w:w="2200"/>
+            <w:tcW w:type="dxa" w:w="1400"/>
+          </w:tcPr>
+          <w:p>
+            <w:pPr>
+              <w:jc w:val="center"/>
+            </w:pPr>
+            <w:r>
+              <w:rPr>
+                <w:rFonts w:ascii="Arial" w:hAnsi="Arial"/>
+                <w:sz w:val="20"/>
+              </w:rPr>
+              <w:t>0.009</w:t>
+            </w:r>
+          </w:p>
+        </w:tc>
+        <w:tc>
+          <w:tcPr>
+            <w:tcW w:type="dxa" w:w="1900"/>
           </w:tcPr>
           <w:p>
             <w:pPr>
@@ -1359,7 +1516,7 @@
         </w:tc>
         <w:tc>
           <w:tcPr>
-            <w:tcW w:type="dxa" w:w="2400"/>
+            <w:tcW w:type="dxa" w:w="2200"/>
           </w:tcPr>
           <w:p>
             <w:pPr>
@@ -1376,7 +1533,7 @@
         </w:tc>
         <w:tc>
           <w:tcPr>
-            <w:tcW w:type="dxa" w:w="1560"/>
+            <w:tcW w:type="dxa" w:w="1160"/>
           </w:tcPr>
           <w:p>
             <w:pPr>
@@ -1395,7 +1552,7 @@
       <w:tr>
         <w:tc>
           <w:tcPr>
-            <w:tcW w:type="dxa" w:w="3200"/>
+            <w:tcW w:type="dxa" w:w="2700"/>
           </w:tcPr>
           <w:p>
             <w:pPr>
@@ -1412,7 +1569,24 @@
         </w:tc>
         <w:tc>
           <w:tcPr>
-            <w:tcW w:type="dxa" w:w="2200"/>
+            <w:tcW w:type="dxa" w:w="1400"/>
+          </w:tcPr>
+          <w:p>
+            <w:pPr>
+              <w:jc w:val="center"/>
+            </w:pPr>
+            <w:r>
+              <w:rPr>
+                <w:rFonts w:ascii="Arial" w:hAnsi="Arial"/>
+                <w:sz w:val="20"/>
+              </w:rPr>
+              <w:t>0.007</w:t>
+            </w:r>
+          </w:p>
+        </w:tc>
+        <w:tc>
+          <w:tcPr>
+            <w:tcW w:type="dxa" w:w="1900"/>
           </w:tcPr>
           <w:p>
             <w:pPr>
@@ -1429,7 +1603,7 @@
         </w:tc>
         <w:tc>
           <w:tcPr>
-            <w:tcW w:type="dxa" w:w="2400"/>
+            <w:tcW w:type="dxa" w:w="2200"/>
           </w:tcPr>
           <w:p>
             <w:pPr>
@@ -1446,7 +1620,7 @@
         </w:tc>
         <w:tc>
           <w:tcPr>
-            <w:tcW w:type="dxa" w:w="1560"/>
+            <w:tcW w:type="dxa" w:w="1160"/>
           </w:tcPr>
           <w:p>
             <w:pPr>

</xml_diff>

<commit_message>
Remove report limitation bullet
</commit_message>
<xml_diff>
--- a/outputs/TENKI_sales_model_boss_report_google_docs.docx
+++ b/outputs/TENKI_sales_model_boss_report_google_docs.docx
@@ -1751,15 +1751,6 @@
         <w:spacing w:after="80"/>
       </w:pPr>
       <w:r>
-        <w:t>Price, discount, coupon, shipping, and stockout data are not included yet.</w:t>
-      </w:r>
-    </w:p>
-    <w:p>
-      <w:pPr>
-        <w:pStyle w:val="ListBullet"/>
-        <w:spacing w:after="80"/>
-      </w:pPr>
-      <w:r>
         <w:t>Future forecasting will require a confirmed future Rakuten promotion calendar.</w:t>
       </w:r>
     </w:p>

</xml_diff>